<commit_message>
refactor: streamline BandaraPelabuhanLlb dashboard components
Simplify component structure by removing legacy code, cleaning up unused imports, and optimizing UI components for the BandaraPelabuhanLlb module.
</commit_message>
<xml_diff>
--- a/public/Kamus_KPI_Dashboard_Biro_Keuangan_dan_PDSI_BP_Batam.docx
+++ b/public/Kamus_KPI_Dashboard_Biro_Keuangan_dan_PDSI_BP_Batam.docx
@@ -7043,6 +7043,21 @@
   <w:style w:type="paragraph" w:styleId="Normal" w:default="1">
     <w:name w:val="Normal"/>
     <w:qFormat/>
+  </w:style>
+  <w:style w:type="table" w:styleId="TableNormal" w:default="true">
+    <w:name w:val="Normal Table"/>
+    <w:uiPriority w:val="99"/>
+    <w:semiHidden/>
+    <w:unhideWhenUsed/>
+    <w:tblPr>
+      <w:tblInd w:type="dxa" w:w="0"/>
+      <w:tblCellMar>
+        <w:top w:type="dxa" w:w="0"/>
+        <w:left w:type="dxa" w:w="108"/>
+        <w:bottom w:type="dxa" w:w="0"/>
+        <w:right w:type="dxa" w:w="108"/>
+      </w:tblCellMar>
+    </w:tblPr>
   </w:style>
   <w:style w:type="paragraph" w:styleId="Title">
     <w:name w:val="Title"/>

</xml_diff>